<commit_message>
Finish ERD lab, build single-file app, sync spec
- speclab.html: single offline file with all modes and the SQL engine
- ERD lab final version; game questions rebalanced so the longest
  option is not a giveaway
- Tests cover all labs (39 passing)
- Spec updated with implementation decisions (Game Rules 5, 11, 13)

Co-Authored-By: Claude Opus 5.5 <noreply@anthropic.com>
Claude-Session: https://claude.ai/code/session_013VJpmi7XZEHMYfbEGeFMCE
</commit_message>
<xml_diff>
--- a/docs/SpecQuest-spec.docx
+++ b/docs/SpecQuest-spec.docx
@@ -14569,7 +14569,7 @@
                 <w:szCs w:val="19"/>
                 <w:rtl/>
               </w:rPr>
-              <w:t xml:space="preserve">במבחן בוס אין רמזים, יש 3 לבבות, ו-8 שאלות מכל שלבי העולם. ניצחון = 100 XP</w:t>
+              <w:t xml:space="preserve">במבחן בוס אין רמזים, יש 3 לבבות, ו-8 שאלות מכל שלבי העולם. ניצחון = 100 XP, בנוסף ל-XP של הכוכבים</w:t>
             </w:r>
           </w:p>
         </w:tc>
@@ -15175,7 +15175,7 @@
                 <w:szCs w:val="19"/>
                 <w:rtl/>
               </w:rPr>
-              <w:t xml:space="preserve">תרגיל במעבדה מזכה ב-XP לפי הציון: ציון × 1. צפייה בפתרון לפני ניסיון שני מבטלת את ה-XP לתרגיל</w:t>
+              <w:t xml:space="preserve">תרגיל במעבדה מזכה ב-XP לפי הציון: ציון × 1. בהגשה חוזרת מתקבל רק השיפור מעל הציון הטוב ביותר. צפייה בפתרון לפני ניסיון שני מבטלת את ה-XP לתרגיל</w:t>
             </w:r>
           </w:p>
         </w:tc>
@@ -15309,6 +15309,107 @@
                 <w:rtl/>
               </w:rPr>
               <w:t xml:space="preserve">10</w:t>
+            </w:r>
+          </w:p>
+        </w:tc>
+      </w:tr>
+      <w:tr>
+        <w:trPr>
+          <w:tblHeader w:val="off"/>
+        </w:trPr>
+        <w:tc>
+          <w:tcPr>
+            <w:tcW w:type="dxa" w:w="1258"/>
+            <w:tcBorders>
+              <w:top w:val="single" w:color="C9CEDB" w:sz="4"/>
+              <w:left w:val="single" w:color="C9CEDB" w:sz="4"/>
+              <w:bottom w:val="single" w:color="C9CEDB" w:sz="4"/>
+              <w:right w:val="single" w:color="C9CEDB" w:sz="4"/>
+            </w:tcBorders>
+            <w:tcMar>
+              <w:top w:type="dxa" w:w="60"/>
+              <w:left w:type="dxa" w:w="100"/>
+              <w:bottom w:type="dxa" w:w="60"/>
+              <w:right w:type="dxa" w:w="100"/>
+            </w:tcMar>
+          </w:tcPr>
+          <w:p>
+            <w:pPr>
+              <w:bidi/>
+              <w:jc w:val="left"/>
+            </w:pPr>
+            <w:r>
+              <w:rPr>
+                <w:rFonts w:ascii="Arial" w:cs="Arial" w:eastAsia="Arial" w:hAnsi="Arial"/>
+                <w:sz w:val="19"/>
+                <w:szCs w:val="19"/>
+                <w:rtl/>
+              </w:rPr>
+              <w:t xml:space="preserve">Game Rule 13</w:t>
+            </w:r>
+          </w:p>
+        </w:tc>
+        <w:tc>
+          <w:tcPr>
+            <w:tcW w:type="dxa" w:w="7333"/>
+            <w:tcBorders>
+              <w:top w:val="single" w:color="C9CEDB" w:sz="4"/>
+              <w:left w:val="single" w:color="C9CEDB" w:sz="4"/>
+              <w:bottom w:val="single" w:color="C9CEDB" w:sz="4"/>
+              <w:right w:val="single" w:color="C9CEDB" w:sz="4"/>
+            </w:tcBorders>
+            <w:tcMar>
+              <w:top w:type="dxa" w:w="60"/>
+              <w:left w:type="dxa" w:w="100"/>
+              <w:bottom w:type="dxa" w:w="60"/>
+              <w:right w:type="dxa" w:w="100"/>
+            </w:tcMar>
+          </w:tcPr>
+          <w:p>
+            <w:pPr>
+              <w:bidi/>
+              <w:jc w:val="left"/>
+            </w:pPr>
+            <w:r>
+              <w:rPr>
+                <w:rFonts w:ascii="Arial" w:cs="Arial" w:eastAsia="Arial" w:hAnsi="Arial"/>
+                <w:sz w:val="19"/>
+                <w:szCs w:val="19"/>
+                <w:rtl/>
+              </w:rPr>
+              <w:t xml:space="preserve">בכל שלב רגיל אפשר להשתמש פעם אחת ברמז 50:50, שמסיר שתי תשובות שגויות. שלב פותח את השלב שאחריו כשהושג בו כוכב אחד לפחות. מבחן הבוס נפתח כשבכל שלבי העולם יש כוכב</w:t>
+            </w:r>
+          </w:p>
+        </w:tc>
+        <w:tc>
+          <w:tcPr>
+            <w:tcW w:type="dxa" w:w="1047"/>
+            <w:tcBorders>
+              <w:top w:val="single" w:color="C9CEDB" w:sz="4"/>
+              <w:left w:val="single" w:color="C9CEDB" w:sz="4"/>
+              <w:bottom w:val="single" w:color="C9CEDB" w:sz="4"/>
+              <w:right w:val="single" w:color="C9CEDB" w:sz="4"/>
+            </w:tcBorders>
+            <w:tcMar>
+              <w:top w:type="dxa" w:w="60"/>
+              <w:left w:type="dxa" w:w="100"/>
+              <w:bottom w:type="dxa" w:w="60"/>
+              <w:right w:type="dxa" w:w="100"/>
+            </w:tcMar>
+          </w:tcPr>
+          <w:p>
+            <w:pPr>
+              <w:bidi/>
+              <w:jc w:val="left"/>
+            </w:pPr>
+            <w:r>
+              <w:rPr>
+                <w:rFonts w:ascii="Arial" w:cs="Arial" w:eastAsia="Arial" w:hAnsi="Arial"/>
+                <w:sz w:val="19"/>
+                <w:szCs w:val="19"/>
+                <w:rtl/>
+              </w:rPr>
+              <w:t xml:space="preserve">2</w:t>
             </w:r>
           </w:p>
         </w:tc>

</xml_diff>